<commit_message>
fix(install): compat macOS dans install-student.sh + notes Apple dans les guides
- env_set : reecriture portable via fichier temporaire (BSD sed sur macOS exige
  `sed -i ''`, GNU non) — l'ecriture du .env ne casse plus sur Apple.
- detect_lan_ip : detection IP LAN portable (hostname -I sur Linux, fallback
  `ipconfig getifaddr enX` puis ifconfig sur macOS). Le recap --server affiche
  desormais l'IP correcte sur Mac.
- guides .docx : notes Apple Silicon (build natif arm64, pas de Rosetta) cote
  eleve et prof.

Co-Authored-By: Claude Opus 4.6 (1M context) <noreply@anthropic.com>
</commit_message>
<xml_diff>
--- a/docs/GUIDE-INSTALL-ELEVE.docx
+++ b/docs/GUIDE-INSTALL-ELEVE.docx
@@ -623,6 +623,18 @@
     </w:p>
     <w:p>
       <w:pPr>
+        <w:shd w:val="clear" w:fill="FFF4D6"/>
+      </w:pPr>
+      <w:r>
+        <w:rPr>
+          <w:b w:val="0"/>
+          <w:sz w:val="21"/>
+        </w:rPr>
+        <w:t>macOS (Apple Silicon M1/M2/M3) : aucune manipulation Rosetta requise, l'image se construit en natif arm64 ; le premier build peut juste etre un peu plus long. Docker Desktop doit etre ouvert avant de lancer.</w:t>
+      </w:r>
+    </w:p>
+    <w:p>
+      <w:pPr>
         <w:pStyle w:val="Heading1"/>
       </w:pPr>
       <w:r>

</xml_diff>

<commit_message>
docs(install): annexe prerequis full (PowerShell, Docker, Git, depannage)
Annexe commune aux guides eleve et prof (nouvelle page) :
- A : debloquer PowerShell (Set-ExecutionPolicy -Scope Process Bypass / CurrentUser
  RemoteSigned, Unblock-File, Get-ExecutionPolicy -List).
- B : installer Docker (Windows WSL2 + virtualisation BIOS, macOS, Linux + groupe
  docker), avec verifs hello-world / compose version.
- C : Git et OpenSSL par OS.
- D : depannage prerequis (script bloque, daemon docker, proxy/firewall, compose v1).

Co-Authored-By: Claude Opus 4.6 (1M context) <noreply@anthropic.com>
</commit_message>
<xml_diff>
--- a/docs/GUIDE-INSTALL-ELEVE.docx
+++ b/docs/GUIDE-INSTALL-ELEVE.docx
@@ -917,6 +917,762 @@
         <w:spacing w:after="80"/>
       </w:pPr>
     </w:p>
+    <w:p>
+      <w:r>
+        <w:br w:type="page"/>
+      </w:r>
+    </w:p>
+    <w:p>
+      <w:pPr>
+        <w:pStyle w:val="Heading1"/>
+      </w:pPr>
+      <w:r>
+        <w:t>Annexes — preparer le poste</w:t>
+      </w:r>
+    </w:p>
+    <w:p>
+      <w:r>
+        <w:t>A faire UNE fois par poste, avant la procedure d'installation. Si une commande echoue, voir l'annexe D (depannage).</w:t>
+      </w:r>
+    </w:p>
+    <w:p>
+      <w:pPr>
+        <w:pStyle w:val="Heading2"/>
+      </w:pPr>
+      <w:r>
+        <w:t>Annexe A — Debloquer PowerShell (Windows)</w:t>
+      </w:r>
+    </w:p>
+    <w:p>
+      <w:r>
+        <w:t>Par defaut, Windows bloque l'execution des scripts .ps1 (ExecutionPolicy = Restricted). Le script install-student.ps1 ne demarrera pas tant que ce n'est pas debloque. Aucun droit administrateur n'est requis pour les methodes ci-dessous.</w:t>
+      </w:r>
+    </w:p>
+    <w:p>
+      <w:r>
+        <w:t>Methode 1 — temporaire, pour la session courante (recommandee). Ouvre PowerShell, puis dans la MEME fenetre :</w:t>
+      </w:r>
+    </w:p>
+    <w:p>
+      <w:pPr>
+        <w:shd w:val="clear" w:fill="F2F2F2"/>
+        <w:spacing w:after="0" w:before="0"/>
+      </w:pPr>
+      <w:r>
+        <w:rPr>
+          <w:rFonts w:ascii="Consolas" w:hAnsi="Consolas"/>
+          <w:sz w:val="19"/>
+        </w:rPr>
+        <w:t>Set-ExecutionPolicy -Scope Process -ExecutionPolicy Bypass</w:t>
+      </w:r>
+    </w:p>
+    <w:p>
+      <w:pPr>
+        <w:shd w:val="clear" w:fill="F2F2F2"/>
+        <w:spacing w:after="0" w:before="0"/>
+      </w:pPr>
+      <w:r>
+        <w:rPr>
+          <w:rFonts w:ascii="Consolas" w:hAnsi="Consolas"/>
+          <w:sz w:val="19"/>
+        </w:rPr>
+        <w:t># puis lance le script dans cette meme fenetre</w:t>
+      </w:r>
+    </w:p>
+    <w:p>
+      <w:pPr>
+        <w:spacing w:after="80"/>
+      </w:pPr>
+    </w:p>
+    <w:p>
+      <w:r>
+        <w:t>Methode 2 — persistante pour ton compte utilisateur :</w:t>
+      </w:r>
+    </w:p>
+    <w:p>
+      <w:pPr>
+        <w:shd w:val="clear" w:fill="F2F2F2"/>
+        <w:spacing w:after="0" w:before="0"/>
+      </w:pPr>
+      <w:r>
+        <w:rPr>
+          <w:rFonts w:ascii="Consolas" w:hAnsi="Consolas"/>
+          <w:sz w:val="19"/>
+        </w:rPr>
+        <w:t>Set-ExecutionPolicy -Scope CurrentUser -ExecutionPolicy RemoteSigned</w:t>
+      </w:r>
+    </w:p>
+    <w:p>
+      <w:pPr>
+        <w:spacing w:after="80"/>
+      </w:pPr>
+    </w:p>
+    <w:p>
+      <w:r>
+        <w:t>Si le fichier a ete telecharge et est marque « bloque » par Windows :</w:t>
+      </w:r>
+    </w:p>
+    <w:p>
+      <w:pPr>
+        <w:shd w:val="clear" w:fill="F2F2F2"/>
+        <w:spacing w:after="0" w:before="0"/>
+      </w:pPr>
+      <w:r>
+        <w:rPr>
+          <w:rFonts w:ascii="Consolas" w:hAnsi="Consolas"/>
+          <w:sz w:val="19"/>
+        </w:rPr>
+        <w:t>Unblock-File .\scripts\install-student.ps1</w:t>
+      </w:r>
+    </w:p>
+    <w:p>
+      <w:pPr>
+        <w:spacing w:after="80"/>
+      </w:pPr>
+    </w:p>
+    <w:p>
+      <w:r>
+        <w:t>Verifier l'etat des politiques par portee :</w:t>
+      </w:r>
+    </w:p>
+    <w:p>
+      <w:pPr>
+        <w:shd w:val="clear" w:fill="F2F2F2"/>
+        <w:spacing w:after="0" w:before="0"/>
+      </w:pPr>
+      <w:r>
+        <w:rPr>
+          <w:rFonts w:ascii="Consolas" w:hAnsi="Consolas"/>
+          <w:sz w:val="19"/>
+        </w:rPr>
+        <w:t>Get-ExecutionPolicy -List</w:t>
+      </w:r>
+    </w:p>
+    <w:p>
+      <w:pPr>
+        <w:spacing w:after="80"/>
+      </w:pPr>
+    </w:p>
+    <w:p>
+      <w:pPr>
+        <w:shd w:val="clear" w:fill="FFF4D6"/>
+      </w:pPr>
+      <w:r>
+        <w:rPr>
+          <w:b w:val="0"/>
+          <w:sz w:val="21"/>
+        </w:rPr>
+        <w:t>Utilise de preference PowerShell 7+ (commande pwsh) plutot que Windows PowerShell 5. Ne lance pas le script « en tant qu'administrateur » : Docker Desktop fonctionne en utilisateur normal.</w:t>
+      </w:r>
+    </w:p>
+    <w:p>
+      <w:pPr>
+        <w:pStyle w:val="Heading2"/>
+      </w:pPr>
+      <w:r>
+        <w:t>Annexe B — Installer Docker</w:t>
+      </w:r>
+    </w:p>
+    <w:p>
+      <w:pPr>
+        <w:pStyle w:val="Heading3"/>
+      </w:pPr>
+      <w:r>
+        <w:t>Windows 10/11</w:t>
+      </w:r>
+    </w:p>
+    <w:p>
+      <w:pPr>
+        <w:pStyle w:val="ListNumber"/>
+      </w:pPr>
+      <w:r>
+        <w:t>Active WSL2 (PowerShell en administrateur), puis redemarre :</w:t>
+      </w:r>
+    </w:p>
+    <w:p>
+      <w:pPr>
+        <w:shd w:val="clear" w:fill="F2F2F2"/>
+        <w:spacing w:after="0" w:before="0"/>
+      </w:pPr>
+      <w:r>
+        <w:rPr>
+          <w:rFonts w:ascii="Consolas" w:hAnsi="Consolas"/>
+          <w:sz w:val="19"/>
+        </w:rPr>
+        <w:t>wsl --install</w:t>
+      </w:r>
+    </w:p>
+    <w:p>
+      <w:pPr>
+        <w:spacing w:after="80"/>
+      </w:pPr>
+    </w:p>
+    <w:p>
+      <w:pPr>
+        <w:pStyle w:val="ListNumber"/>
+      </w:pPr>
+      <w:r>
+        <w:t>Installe Docker Desktop depuis docker.com (backend WSL2 par defaut).</w:t>
+      </w:r>
+    </w:p>
+    <w:p>
+      <w:pPr>
+        <w:pStyle w:val="ListNumber"/>
+      </w:pPr>
+      <w:r>
+        <w:t>Lance Docker Desktop et attends le statut « running » (icone baleine).</w:t>
+      </w:r>
+    </w:p>
+    <w:p>
+      <w:pPr>
+        <w:pStyle w:val="ListNumber"/>
+      </w:pPr>
+      <w:r>
+        <w:t>Verifie dans un terminal :</w:t>
+      </w:r>
+    </w:p>
+    <w:p>
+      <w:pPr>
+        <w:shd w:val="clear" w:fill="F2F2F2"/>
+        <w:spacing w:after="0" w:before="0"/>
+      </w:pPr>
+      <w:r>
+        <w:rPr>
+          <w:rFonts w:ascii="Consolas" w:hAnsi="Consolas"/>
+          <w:sz w:val="19"/>
+        </w:rPr>
+        <w:t>docker run --rm hello-world</w:t>
+      </w:r>
+    </w:p>
+    <w:p>
+      <w:pPr>
+        <w:shd w:val="clear" w:fill="F2F2F2"/>
+        <w:spacing w:after="0" w:before="0"/>
+      </w:pPr>
+      <w:r>
+        <w:rPr>
+          <w:rFonts w:ascii="Consolas" w:hAnsi="Consolas"/>
+          <w:sz w:val="19"/>
+        </w:rPr>
+        <w:t>docker compose version</w:t>
+      </w:r>
+    </w:p>
+    <w:p>
+      <w:pPr>
+        <w:spacing w:after="80"/>
+      </w:pPr>
+    </w:p>
+    <w:p>
+      <w:pPr>
+        <w:shd w:val="clear" w:fill="FFF4D6"/>
+      </w:pPr>
+      <w:r>
+        <w:rPr>
+          <w:b w:val="0"/>
+          <w:sz w:val="21"/>
+        </w:rPr>
+        <w:t>Erreur de virtualisation : active « Virtualization / SVM / VT-x » dans le BIOS/UEFI, et la fonctionnalite Windows « Plateforme de machine virtuelle ».</w:t>
+      </w:r>
+    </w:p>
+    <w:p>
+      <w:pPr>
+        <w:pStyle w:val="Heading3"/>
+      </w:pPr>
+      <w:r>
+        <w:t>macOS</w:t>
+      </w:r>
+    </w:p>
+    <w:p>
+      <w:pPr>
+        <w:pStyle w:val="ListNumber"/>
+      </w:pPr>
+      <w:r>
+        <w:t>Telecharge Docker Desktop pour Mac (choisis la puce : Apple Silicon ou Intel).</w:t>
+      </w:r>
+    </w:p>
+    <w:p>
+      <w:pPr>
+        <w:pStyle w:val="ListNumber"/>
+      </w:pPr>
+      <w:r>
+        <w:t>Glisse Docker dans Applications, lance-le, attends « running ».</w:t>
+      </w:r>
+    </w:p>
+    <w:p>
+      <w:pPr>
+        <w:pStyle w:val="ListNumber"/>
+      </w:pPr>
+      <w:r>
+        <w:t>Verifie :</w:t>
+      </w:r>
+    </w:p>
+    <w:p>
+      <w:pPr>
+        <w:shd w:val="clear" w:fill="F2F2F2"/>
+        <w:spacing w:after="0" w:before="0"/>
+      </w:pPr>
+      <w:r>
+        <w:rPr>
+          <w:rFonts w:ascii="Consolas" w:hAnsi="Consolas"/>
+          <w:sz w:val="19"/>
+        </w:rPr>
+        <w:t>docker run --rm hello-world</w:t>
+      </w:r>
+    </w:p>
+    <w:p>
+      <w:pPr>
+        <w:shd w:val="clear" w:fill="F2F2F2"/>
+        <w:spacing w:after="0" w:before="0"/>
+      </w:pPr>
+      <w:r>
+        <w:rPr>
+          <w:rFonts w:ascii="Consolas" w:hAnsi="Consolas"/>
+          <w:sz w:val="19"/>
+        </w:rPr>
+        <w:t>docker compose version</w:t>
+      </w:r>
+    </w:p>
+    <w:p>
+      <w:pPr>
+        <w:spacing w:after="80"/>
+      </w:pPr>
+    </w:p>
+    <w:p>
+      <w:pPr>
+        <w:pStyle w:val="Heading3"/>
+      </w:pPr>
+      <w:r>
+        <w:t>Linux (Debian / Ubuntu)</w:t>
+      </w:r>
+    </w:p>
+    <w:p>
+      <w:r>
+        <w:t>Installe Docker Engine + le plugin compose v2 (depot officiel Docker), puis ajoute ton utilisateur au groupe docker :</w:t>
+      </w:r>
+    </w:p>
+    <w:p>
+      <w:pPr>
+        <w:shd w:val="clear" w:fill="F2F2F2"/>
+        <w:spacing w:after="0" w:before="0"/>
+      </w:pPr>
+      <w:r>
+        <w:rPr>
+          <w:rFonts w:ascii="Consolas" w:hAnsi="Consolas"/>
+          <w:sz w:val="19"/>
+        </w:rPr>
+        <w:t># suivre https://docs.docker.com/engine/install/ pour le depot apt officiel</w:t>
+      </w:r>
+    </w:p>
+    <w:p>
+      <w:pPr>
+        <w:shd w:val="clear" w:fill="F2F2F2"/>
+        <w:spacing w:after="0" w:before="0"/>
+      </w:pPr>
+      <w:r>
+        <w:rPr>
+          <w:rFonts w:ascii="Consolas" w:hAnsi="Consolas"/>
+          <w:sz w:val="19"/>
+        </w:rPr>
+        <w:t>sudo usermod -aG docker $USER</w:t>
+      </w:r>
+    </w:p>
+    <w:p>
+      <w:pPr>
+        <w:shd w:val="clear" w:fill="F2F2F2"/>
+        <w:spacing w:after="0" w:before="0"/>
+      </w:pPr>
+      <w:r>
+        <w:rPr>
+          <w:rFonts w:ascii="Consolas" w:hAnsi="Consolas"/>
+          <w:sz w:val="19"/>
+        </w:rPr>
+        <w:t># se deconnecter / reconnecter (ou : newgrp docker) pour appliquer le groupe</w:t>
+      </w:r>
+    </w:p>
+    <w:p>
+      <w:pPr>
+        <w:shd w:val="clear" w:fill="F2F2F2"/>
+        <w:spacing w:after="0" w:before="0"/>
+      </w:pPr>
+      <w:r>
+        <w:rPr>
+          <w:rFonts w:ascii="Consolas" w:hAnsi="Consolas"/>
+          <w:sz w:val="19"/>
+        </w:rPr>
+        <w:t>docker compose version</w:t>
+      </w:r>
+    </w:p>
+    <w:p>
+      <w:pPr>
+        <w:spacing w:after="80"/>
+      </w:pPr>
+    </w:p>
+    <w:p>
+      <w:pPr>
+        <w:pStyle w:val="Heading2"/>
+      </w:pPr>
+      <w:r>
+        <w:t>Annexe C — Git et OpenSSL</w:t>
+      </w:r>
+    </w:p>
+    <w:tbl>
+      <w:tblPr>
+        <w:tblStyle w:val="TableGrid"/>
+        <w:tblW w:type="auto" w:w="0"/>
+        <w:tblLook w:firstColumn="1" w:firstRow="1" w:lastColumn="0" w:lastRow="0" w:noHBand="0" w:noVBand="1" w:val="04A0"/>
+      </w:tblPr>
+      <w:tblGrid>
+        <w:gridCol w:w="4819"/>
+        <w:gridCol w:w="4819"/>
+      </w:tblGrid>
+      <w:tr>
+        <w:tc>
+          <w:tcPr>
+            <w:tcW w:type="dxa" w:w="2268"/>
+          </w:tcPr>
+          <w:p>
+            <w:pPr>
+              <w:shd w:val="clear" w:fill="D5E8F0"/>
+            </w:pPr>
+            <w:r/>
+            <w:r>
+              <w:rPr>
+                <w:b/>
+                <w:sz w:val="20"/>
+              </w:rPr>
+              <w:t>Systeme</w:t>
+            </w:r>
+          </w:p>
+        </w:tc>
+        <w:tc>
+          <w:tcPr>
+            <w:tcW w:type="dxa" w:w="7370"/>
+          </w:tcPr>
+          <w:p>
+            <w:pPr>
+              <w:shd w:val="clear" w:fill="D5E8F0"/>
+            </w:pPr>
+            <w:r/>
+            <w:r>
+              <w:rPr>
+                <w:b/>
+                <w:sz w:val="20"/>
+              </w:rPr>
+              <w:t>Commande / source</w:t>
+            </w:r>
+          </w:p>
+        </w:tc>
+      </w:tr>
+      <w:tr>
+        <w:tc>
+          <w:tcPr>
+            <w:tcW w:type="dxa" w:w="2268"/>
+          </w:tcPr>
+          <w:p>
+            <w:r/>
+            <w:r>
+              <w:rPr>
+                <w:sz w:val="20"/>
+              </w:rPr>
+              <w:t>Windows</w:t>
+            </w:r>
+          </w:p>
+        </w:tc>
+        <w:tc>
+          <w:tcPr>
+            <w:tcW w:type="dxa" w:w="7370"/>
+          </w:tcPr>
+          <w:p>
+            <w:r/>
+            <w:r>
+              <w:rPr>
+                <w:sz w:val="20"/>
+              </w:rPr>
+              <w:t>Git for Windows (git-scm.com) — fournit git, openssl et Git Bash</w:t>
+            </w:r>
+          </w:p>
+        </w:tc>
+      </w:tr>
+      <w:tr>
+        <w:tc>
+          <w:tcPr>
+            <w:tcW w:type="dxa" w:w="2268"/>
+          </w:tcPr>
+          <w:p>
+            <w:r/>
+            <w:r>
+              <w:rPr>
+                <w:sz w:val="20"/>
+              </w:rPr>
+              <w:t>macOS</w:t>
+            </w:r>
+          </w:p>
+        </w:tc>
+        <w:tc>
+          <w:tcPr>
+            <w:tcW w:type="dxa" w:w="7370"/>
+          </w:tcPr>
+          <w:p>
+            <w:r/>
+            <w:r>
+              <w:rPr>
+                <w:sz w:val="20"/>
+              </w:rPr>
+              <w:t>xcode-select --install (git) ; openssl deja present</w:t>
+            </w:r>
+          </w:p>
+        </w:tc>
+      </w:tr>
+      <w:tr>
+        <w:tc>
+          <w:tcPr>
+            <w:tcW w:type="dxa" w:w="2268"/>
+          </w:tcPr>
+          <w:p>
+            <w:r/>
+            <w:r>
+              <w:rPr>
+                <w:sz w:val="20"/>
+              </w:rPr>
+              <w:t>Linux</w:t>
+            </w:r>
+          </w:p>
+        </w:tc>
+        <w:tc>
+          <w:tcPr>
+            <w:tcW w:type="dxa" w:w="7370"/>
+          </w:tcPr>
+          <w:p>
+            <w:r/>
+            <w:r>
+              <w:rPr>
+                <w:sz w:val="20"/>
+              </w:rPr>
+              <w:t>sudo apt install git openssl</w:t>
+            </w:r>
+          </w:p>
+        </w:tc>
+      </w:tr>
+    </w:tbl>
+    <w:p>
+      <w:pPr>
+        <w:shd w:val="clear" w:fill="FFF4D6"/>
+      </w:pPr>
+      <w:r>
+        <w:rPr>
+          <w:b w:val="0"/>
+          <w:sz w:val="21"/>
+        </w:rPr>
+        <w:t>Le script genere les jetons avec openssl. Sous Windows, si openssl manque, il bascule sur un generateur .NET integre — aucune action requise.</w:t>
+      </w:r>
+    </w:p>
+    <w:p>
+      <w:pPr>
+        <w:pStyle w:val="Heading2"/>
+      </w:pPr>
+      <w:r>
+        <w:t>Annexe D — Depannage des prerequis</w:t>
+      </w:r>
+    </w:p>
+    <w:tbl>
+      <w:tblPr>
+        <w:tblStyle w:val="TableGrid"/>
+        <w:tblW w:type="auto" w:w="0"/>
+        <w:tblLook w:firstColumn="1" w:firstRow="1" w:lastColumn="0" w:lastRow="0" w:noHBand="0" w:noVBand="1" w:val="04A0"/>
+      </w:tblPr>
+      <w:tblGrid>
+        <w:gridCol w:w="4819"/>
+        <w:gridCol w:w="4819"/>
+      </w:tblGrid>
+      <w:tr>
+        <w:tc>
+          <w:tcPr>
+            <w:tcW w:type="dxa" w:w="3402"/>
+          </w:tcPr>
+          <w:p>
+            <w:pPr>
+              <w:shd w:val="clear" w:fill="D5E8F0"/>
+            </w:pPr>
+            <w:r/>
+            <w:r>
+              <w:rPr>
+                <w:b/>
+                <w:sz w:val="20"/>
+              </w:rPr>
+              <w:t>Symptome</w:t>
+            </w:r>
+          </w:p>
+        </w:tc>
+        <w:tc>
+          <w:tcPr>
+            <w:tcW w:type="dxa" w:w="6236"/>
+          </w:tcPr>
+          <w:p>
+            <w:pPr>
+              <w:shd w:val="clear" w:fill="D5E8F0"/>
+            </w:pPr>
+            <w:r/>
+            <w:r>
+              <w:rPr>
+                <w:b/>
+                <w:sz w:val="20"/>
+              </w:rPr>
+              <w:t>Cause / solution</w:t>
+            </w:r>
+          </w:p>
+        </w:tc>
+      </w:tr>
+      <w:tr>
+        <w:tc>
+          <w:tcPr>
+            <w:tcW w:type="dxa" w:w="3402"/>
+          </w:tcPr>
+          <w:p>
+            <w:r/>
+            <w:r>
+              <w:rPr>
+                <w:sz w:val="20"/>
+              </w:rPr>
+              <w:t>« running scripts is disabled on this system »</w:t>
+            </w:r>
+          </w:p>
+        </w:tc>
+        <w:tc>
+          <w:tcPr>
+            <w:tcW w:type="dxa" w:w="6236"/>
+          </w:tcPr>
+          <w:p>
+            <w:r/>
+            <w:r>
+              <w:rPr>
+                <w:sz w:val="20"/>
+              </w:rPr>
+              <w:t>PowerShell bloque : voir Annexe A (Set-ExecutionPolicy -Scope Process Bypass).</w:t>
+            </w:r>
+          </w:p>
+        </w:tc>
+      </w:tr>
+      <w:tr>
+        <w:tc>
+          <w:tcPr>
+            <w:tcW w:type="dxa" w:w="3402"/>
+          </w:tcPr>
+          <w:p>
+            <w:r/>
+            <w:r>
+              <w:rPr>
+                <w:sz w:val="20"/>
+              </w:rPr>
+              <w:t>« docker : command not found » / « cannot connect to the Docker daemon »</w:t>
+            </w:r>
+          </w:p>
+        </w:tc>
+        <w:tc>
+          <w:tcPr>
+            <w:tcW w:type="dxa" w:w="6236"/>
+          </w:tcPr>
+          <w:p>
+            <w:r/>
+            <w:r>
+              <w:rPr>
+                <w:sz w:val="20"/>
+              </w:rPr>
+              <w:t>Docker Desktop n'est pas demarre, ou (Linux) groupe docker pas applique : ouvre Docker Desktop / reconnecte-toi.</w:t>
+            </w:r>
+          </w:p>
+        </w:tc>
+      </w:tr>
+      <w:tr>
+        <w:tc>
+          <w:tcPr>
+            <w:tcW w:type="dxa" w:w="3402"/>
+          </w:tcPr>
+          <w:p>
+            <w:r/>
+            <w:r>
+              <w:rPr>
+                <w:sz w:val="20"/>
+              </w:rPr>
+              <w:t>Le clone git echoue ou reste bloque</w:t>
+            </w:r>
+          </w:p>
+        </w:tc>
+        <w:tc>
+          <w:tcPr>
+            <w:tcW w:type="dxa" w:w="6236"/>
+          </w:tcPr>
+          <w:p>
+            <w:r/>
+            <w:r>
+              <w:rPr>
+                <w:sz w:val="20"/>
+              </w:rPr>
+              <w:t>Proxy ou pare-feu d'entreprise : configure git (http.proxy) ou utilise un reseau ouvert pour le clone.</w:t>
+            </w:r>
+          </w:p>
+        </w:tc>
+      </w:tr>
+      <w:tr>
+        <w:tc>
+          <w:tcPr>
+            <w:tcW w:type="dxa" w:w="3402"/>
+          </w:tcPr>
+          <w:p>
+            <w:r/>
+            <w:r>
+              <w:rPr>
+                <w:sz w:val="20"/>
+              </w:rPr>
+              <w:t>Le build s'arrete au telechargement d'images</w:t>
+            </w:r>
+          </w:p>
+        </w:tc>
+        <w:tc>
+          <w:tcPr>
+            <w:tcW w:type="dxa" w:w="6236"/>
+          </w:tcPr>
+          <w:p>
+            <w:r/>
+            <w:r>
+              <w:rPr>
+                <w:sz w:val="20"/>
+              </w:rPr>
+              <w:t>Proxy Docker : configure le proxy dans Docker Desktop (Settings &gt; Resources &gt; Proxies).</w:t>
+            </w:r>
+          </w:p>
+        </w:tc>
+      </w:tr>
+      <w:tr>
+        <w:tc>
+          <w:tcPr>
+            <w:tcW w:type="dxa" w:w="3402"/>
+          </w:tcPr>
+          <w:p>
+            <w:r/>
+            <w:r>
+              <w:rPr>
+                <w:sz w:val="20"/>
+              </w:rPr>
+              <w:t>docker compose version affiche v1.x</w:t>
+            </w:r>
+          </w:p>
+        </w:tc>
+        <w:tc>
+          <w:tcPr>
+            <w:tcW w:type="dxa" w:w="6236"/>
+          </w:tcPr>
+          <w:p>
+            <w:r/>
+            <w:r>
+              <w:rPr>
+                <w:sz w:val="20"/>
+              </w:rPr>
+              <w:t>Plugin compose v2 absent : installe docker compose v2 (docker-compose-plugin).</w:t>
+            </w:r>
+          </w:p>
+        </w:tc>
+      </w:tr>
+    </w:tbl>
     <w:sectPr>
       <w:pgSz w:w="11906" w:h="16838"/>
       <w:pgMar w:top="1134" w:right="1134" w:bottom="1134" w:left="1134" w:header="720" w:footer="720" w:gutter="0"/>

</xml_diff>

<commit_message>
fix(docker): correction arm64 APT::Cache-Start + docs Docker install bilingues
- Dockerfile.juicelab : ajoute APT::Cache-Start "100663296" via apt.conf.d
  dans les stages builder et runtime pour corriger le bug apt sur arm64
  (Qualcomm X1E, Apple Silicon) où la liste bullseye/arm64 depasse 29 MB.
- STUDENT-INSTALL-FR/EN.md : distingue methode A (docker-compose-v2) et
  methode B (docker-compose-plugin), note arm64, annexe complete.
- generate_install_guides.py : meme correction dans Annexe B Linux +
  tableau depannage mis a jour.
- build_guide_docker.py : nouveau script generant le guide Docker standalone.
- GUIDE-INSTALL-ELEVE.docx, GUIDE-INSTALL-PROF.docx : regeneres.
- Guide_Installation_Docker_JuiceLab.docx : nouveau fichier.
- scripts/install-student.sh : bit executable restaure.

Co-Authored-By: Claude Sonnet 4.6 <noreply@anthropic.com>
</commit_message>
<xml_diff>
--- a/docs/GUIDE-INSTALL-ELEVE.docx
+++ b/docs/GUIDE-INSTALL-ELEVE.docx
@@ -43,58 +43,6 @@
     <w:p>
       <w:r>
         <w:t>JuiceLab fait tourner OWASP Juice Shop (la plateforme du TD) sur ton propre poste. Pendant que tu joues, ton poste envoie ta progression au dashboard du professeur, qui suit toute la cohorte en temps reel. Tu n'ouvres jamais le dashboard toi-meme.</w:t>
-      </w:r>
-    </w:p>
-    <w:p>
-      <w:pPr>
-        <w:jc w:val="center"/>
-      </w:pPr>
-      <w:r>
-        <w:drawing>
-          <wp:inline xmlns:a="http://schemas.openxmlformats.org/drawingml/2006/main" xmlns:pic="http://schemas.openxmlformats.org/drawingml/2006/picture">
-            <wp:extent cx="5669280" cy="10011707"/>
-            <wp:docPr id="1" name="Picture 1"/>
-            <wp:cNvGraphicFramePr>
-              <a:graphicFrameLocks noChangeAspect="1"/>
-            </wp:cNvGraphicFramePr>
-            <a:graphic>
-              <a:graphicData uri="http://schemas.openxmlformats.org/drawingml/2006/picture">
-                <pic:pic>
-                  <pic:nvPicPr>
-                    <pic:cNvPr id="0" name="scenario4.png"/>
-                    <pic:cNvPicPr/>
-                  </pic:nvPicPr>
-                  <pic:blipFill>
-                    <a:blip r:embed="rId9"/>
-                    <a:stretch>
-                      <a:fillRect/>
-                    </a:stretch>
-                  </pic:blipFill>
-                  <pic:spPr>
-                    <a:xfrm>
-                      <a:off x="0" y="0"/>
-                      <a:ext cx="5669280" cy="10011707"/>
-                    </a:xfrm>
-                    <a:prstGeom prst="rect"/>
-                  </pic:spPr>
-                </pic:pic>
-              </a:graphicData>
-            </a:graphic>
-          </wp:inline>
-        </w:drawing>
-      </w:r>
-    </w:p>
-    <w:p>
-      <w:pPr>
-        <w:jc w:val="center"/>
-      </w:pPr>
-      <w:r>
-        <w:rPr>
-          <w:i/>
-          <w:color w:val="222222"/>
-          <w:sz w:val="18"/>
-        </w:rPr>
-        <w:t>Ton poste pousse ses events vers le dashboard du prof (scenario 4).</w:t>
       </w:r>
     </w:p>
     <w:p>
@@ -451,7 +399,7 @@
               <w:rPr>
                 <w:sz w:val="20"/>
               </w:rPr>
-              <w:t>Docker Engine + plugin docker compose v2 + git + openssl</w:t>
+              <w:t>Docker Engine + docker compose v2 + git + openssl (voir Annexe B)</w:t>
             </w:r>
           </w:p>
         </w:tc>
@@ -1247,7 +1195,12 @@
     </w:p>
     <w:p>
       <w:r>
-        <w:t>Installe Docker Engine + le plugin compose v2 (depot officiel Docker), puis ajoute ton utilisateur au groupe docker :</w:t>
+        <w:t>Deux methodes mutuellement exclusives. Choisis l'une OU l'autre.</w:t>
+      </w:r>
+    </w:p>
+    <w:p>
+      <w:r>
+        <w:t>Methode A — paquets de la distribution (recommandee pour un TD) :</w:t>
       </w:r>
     </w:p>
     <w:p>
@@ -1260,7 +1213,20 @@
           <w:rFonts w:ascii="Consolas" w:hAnsi="Consolas"/>
           <w:sz w:val="19"/>
         </w:rPr>
-        <w:t># suivre https://docs.docker.com/engine/install/ pour le depot apt officiel</w:t>
+        <w:t>sudo apt update</w:t>
+      </w:r>
+    </w:p>
+    <w:p>
+      <w:pPr>
+        <w:shd w:val="clear" w:fill="F2F2F2"/>
+        <w:spacing w:after="0" w:before="0"/>
+      </w:pPr>
+      <w:r>
+        <w:rPr>
+          <w:rFonts w:ascii="Consolas" w:hAnsi="Consolas"/>
+          <w:sz w:val="19"/>
+        </w:rPr>
+        <w:t>sudo apt install -y docker-compose-v2</w:t>
       </w:r>
     </w:p>
     <w:p>
@@ -1286,7 +1252,7 @@
           <w:rFonts w:ascii="Consolas" w:hAnsi="Consolas"/>
           <w:sz w:val="19"/>
         </w:rPr>
-        <w:t># se deconnecter / reconnecter (ou : newgrp docker) pour appliquer le groupe</w:t>
+        <w:t>newgrp docker   # ou se deconnecter puis se reconnecter</w:t>
       </w:r>
     </w:p>
     <w:p>
@@ -1306,6 +1272,106 @@
       <w:pPr>
         <w:spacing w:after="80"/>
       </w:pPr>
+    </w:p>
+    <w:p>
+      <w:r>
+        <w:t>Methode B — depot officiel Docker (si tu veux la derniere version) :</w:t>
+      </w:r>
+    </w:p>
+    <w:p>
+      <w:pPr>
+        <w:shd w:val="clear" w:fill="F2F2F2"/>
+        <w:spacing w:after="0" w:before="0"/>
+      </w:pPr>
+      <w:r>
+        <w:rPr>
+          <w:rFonts w:ascii="Consolas" w:hAnsi="Consolas"/>
+          <w:sz w:val="19"/>
+        </w:rPr>
+        <w:t># configurer le depot officiel : https://docs.docker.com/engine/install/ubuntu/</w:t>
+      </w:r>
+    </w:p>
+    <w:p>
+      <w:pPr>
+        <w:shd w:val="clear" w:fill="F2F2F2"/>
+        <w:spacing w:after="0" w:before="0"/>
+      </w:pPr>
+      <w:r>
+        <w:rPr>
+          <w:rFonts w:ascii="Consolas" w:hAnsi="Consolas"/>
+          <w:sz w:val="19"/>
+        </w:rPr>
+        <w:t>sudo apt install -y docker-ce docker-ce-cli containerd.io \</w:t>
+      </w:r>
+    </w:p>
+    <w:p>
+      <w:pPr>
+        <w:shd w:val="clear" w:fill="F2F2F2"/>
+        <w:spacing w:after="0" w:before="0"/>
+      </w:pPr>
+      <w:r>
+        <w:rPr>
+          <w:rFonts w:ascii="Consolas" w:hAnsi="Consolas"/>
+          <w:sz w:val="19"/>
+        </w:rPr>
+        <w:t xml:space="preserve">    docker-buildx-plugin docker-compose-plugin</w:t>
+      </w:r>
+    </w:p>
+    <w:p>
+      <w:pPr>
+        <w:shd w:val="clear" w:fill="F2F2F2"/>
+        <w:spacing w:after="0" w:before="0"/>
+      </w:pPr>
+      <w:r>
+        <w:rPr>
+          <w:rFonts w:ascii="Consolas" w:hAnsi="Consolas"/>
+          <w:sz w:val="19"/>
+        </w:rPr>
+        <w:t>sudo usermod -aG docker $USER</w:t>
+      </w:r>
+    </w:p>
+    <w:p>
+      <w:pPr>
+        <w:shd w:val="clear" w:fill="F2F2F2"/>
+        <w:spacing w:after="0" w:before="0"/>
+      </w:pPr>
+      <w:r>
+        <w:rPr>
+          <w:rFonts w:ascii="Consolas" w:hAnsi="Consolas"/>
+          <w:sz w:val="19"/>
+        </w:rPr>
+        <w:t>newgrp docker</w:t>
+      </w:r>
+    </w:p>
+    <w:p>
+      <w:pPr>
+        <w:shd w:val="clear" w:fill="F2F2F2"/>
+        <w:spacing w:after="0" w:before="0"/>
+      </w:pPr>
+      <w:r>
+        <w:rPr>
+          <w:rFonts w:ascii="Consolas" w:hAnsi="Consolas"/>
+          <w:sz w:val="19"/>
+        </w:rPr>
+        <w:t>docker compose version</w:t>
+      </w:r>
+    </w:p>
+    <w:p>
+      <w:pPr>
+        <w:spacing w:after="80"/>
+      </w:pPr>
+    </w:p>
+    <w:p>
+      <w:pPr>
+        <w:shd w:val="clear" w:fill="FFF4D6"/>
+      </w:pPr>
+      <w:r>
+        <w:rPr>
+          <w:b w:val="0"/>
+          <w:sz w:val="21"/>
+        </w:rPr>
+        <w:t>Les deux paquets sont mutuellement exclusifs. Sur Ubuntu 25.04+, utilise la methode A (docker-compose-v2). Ne melange jamais les deux.</w:t>
+      </w:r>
     </w:p>
     <w:p>
       <w:pPr>
@@ -1653,7 +1719,7 @@
               <w:rPr>
                 <w:sz w:val="20"/>
               </w:rPr>
-              <w:t>docker compose version affiche v1.x</w:t>
+              <w:t>docker compose version affiche v1.x ou commande introuvable</w:t>
             </w:r>
           </w:p>
         </w:tc>
@@ -1667,7 +1733,7 @@
               <w:rPr>
                 <w:sz w:val="20"/>
               </w:rPr>
-              <w:t>Plugin compose v2 absent : installe docker compose v2 (docker-compose-plugin).</w:t>
+              <w:t>Plugin compose v2 absent. Ubuntu/Debian standard : sudo apt install docker-compose-v2. Depot officiel Docker : sudo apt install docker-compose-plugin. Ne pas installer les deux (conflit).</w:t>
             </w:r>
           </w:p>
         </w:tc>

</xml_diff>

<commit_message>
docs: clarifier ecran pre-login JuiceLab et avertissement dashboard injoignable
- /#/juicelab affiche "Connecte-toi a Juice Shop" avant login : normal,
  documente dans le tableau de verification et en note explicite.
- "!!! Dashboard prof injoignable" a l'install : normal en scenario 4
  quand le prof n'a pas encore lance --server, ajoute en note.
- Corrections dans STUDENT-INSTALL-FR/EN.md et generate_install_guides.py.
- GUIDE-INSTALL-ELEVE.docx regenere.

Co-Authored-By: Claude Sonnet 4.6 <noreply@anthropic.com>
</commit_message>
<xml_diff>
--- a/docs/GUIDE-INSTALL-ELEVE.docx
+++ b/docs/GUIDE-INSTALL-ELEVE.docx
@@ -622,6 +622,30 @@
       <w:pPr>
         <w:spacing w:after="80"/>
       </w:pPr>
+    </w:p>
+    <w:p>
+      <w:pPr>
+        <w:shd w:val="clear" w:fill="FFF4D6"/>
+      </w:pPr>
+      <w:r>
+        <w:rPr>
+          <w:b w:val="0"/>
+          <w:sz w:val="21"/>
+        </w:rPr>
+        <w:t>Tu vois « Connecte-toi a Juice Shop » ? C'est normal avant le login. Va sur /#/register, cree un compte, connecte-toi, puis reviens ici — le panneau s'affiche automatiquement.</w:t>
+      </w:r>
+    </w:p>
+    <w:p>
+      <w:pPr>
+        <w:shd w:val="clear" w:fill="FFF4D6"/>
+      </w:pPr>
+      <w:r>
+        <w:rPr>
+          <w:b w:val="0"/>
+          <w:sz w:val="21"/>
+        </w:rPr>
+        <w:t>Le script affiche « !!! Dashboard prof injoignable » ? Normal si le prof n'a pas encore lance son dashboard ou que tu n'es pas sur le meme reseau. L'installation est reussie : les events partiront des que le dashboard sera disponible.</w:t>
+      </w:r>
     </w:p>
     <w:p>
       <w:pPr>

</xml_diff>

<commit_message>
docs: expliquer la difference label (-l) vs compte Juice Shop
Le label defini a l'install identifie le poste dans la matrice prof.
L'email Juice Shop debloque le panneau JuiceLab mais n'est pas affiche
en scenario 4 standard. Ajout dans STUDENT-INSTALL FR/EN (note tableau
+ point 3.3) et generate_install_guides.py (tableau + note).

Co-Authored-By: Claude Sonnet 4.6 <noreply@anthropic.com>
</commit_message>
<xml_diff>
--- a/docs/GUIDE-INSTALL-ELEVE.docx
+++ b/docs/GUIDE-INSTALL-ELEVE.docx
@@ -658,6 +658,174 @@
     <w:p>
       <w:r>
         <w:t>Des que tu reveles un indice ou resous un challenge, ta progression remonte automatiquement chez le prof.</w:t>
+      </w:r>
+    </w:p>
+    <w:tbl>
+      <w:tblPr>
+        <w:tblStyle w:val="TableGrid"/>
+        <w:tblW w:type="auto" w:w="0"/>
+        <w:tblLook w:firstColumn="1" w:firstRow="1" w:lastColumn="0" w:lastRow="0" w:noHBand="0" w:noVBand="1" w:val="04A0"/>
+      </w:tblPr>
+      <w:tblGrid>
+        <w:gridCol w:w="3213"/>
+        <w:gridCol w:w="3213"/>
+        <w:gridCol w:w="3213"/>
+      </w:tblGrid>
+      <w:tr>
+        <w:tc>
+          <w:tcPr>
+            <w:tcW w:type="dxa" w:w="2268"/>
+          </w:tcPr>
+          <w:p>
+            <w:pPr>
+              <w:shd w:val="clear" w:fill="D5E8F0"/>
+            </w:pPr>
+            <w:r/>
+            <w:r>
+              <w:rPr>
+                <w:b/>
+                <w:sz w:val="20"/>
+              </w:rPr>
+              <w:t>Identifiant</w:t>
+            </w:r>
+          </w:p>
+        </w:tc>
+        <w:tc>
+          <w:tcPr>
+            <w:tcW w:type="dxa" w:w="3685"/>
+          </w:tcPr>
+          <w:p>
+            <w:pPr>
+              <w:shd w:val="clear" w:fill="D5E8F0"/>
+            </w:pPr>
+            <w:r/>
+            <w:r>
+              <w:rPr>
+                <w:b/>
+                <w:sz w:val="20"/>
+              </w:rPr>
+              <w:t>Origine</w:t>
+            </w:r>
+          </w:p>
+        </w:tc>
+        <w:tc>
+          <w:tcPr>
+            <w:tcW w:type="dxa" w:w="3685"/>
+          </w:tcPr>
+          <w:p>
+            <w:pPr>
+              <w:shd w:val="clear" w:fill="D5E8F0"/>
+            </w:pPr>
+            <w:r/>
+            <w:r>
+              <w:rPr>
+                <w:b/>
+                <w:sz w:val="20"/>
+              </w:rPr>
+              <w:t>Role</w:t>
+            </w:r>
+          </w:p>
+        </w:tc>
+      </w:tr>
+      <w:tr>
+        <w:tc>
+          <w:tcPr>
+            <w:tcW w:type="dxa" w:w="2268"/>
+          </w:tcPr>
+          <w:p>
+            <w:r/>
+            <w:r>
+              <w:rPr>
+                <w:sz w:val="20"/>
+              </w:rPr>
+              <w:t>Label (-l fabrice)</w:t>
+            </w:r>
+          </w:p>
+        </w:tc>
+        <w:tc>
+          <w:tcPr>
+            <w:tcW w:type="dxa" w:w="3685"/>
+          </w:tcPr>
+          <w:p>
+            <w:r/>
+            <w:r>
+              <w:rPr>
+                <w:sz w:val="20"/>
+              </w:rPr>
+              <w:t>docker/.env, defini par le prof a l'install</w:t>
+            </w:r>
+          </w:p>
+        </w:tc>
+        <w:tc>
+          <w:tcPr>
+            <w:tcW w:type="dxa" w:w="3685"/>
+          </w:tcPr>
+          <w:p>
+            <w:r/>
+            <w:r>
+              <w:rPr>
+                <w:sz w:val="20"/>
+              </w:rPr>
+              <w:t>Identifie ton poste dans la matrice cohorte — fixe, independant de Juice Shop</w:t>
+            </w:r>
+          </w:p>
+        </w:tc>
+      </w:tr>
+      <w:tr>
+        <w:tc>
+          <w:tcPr>
+            <w:tcW w:type="dxa" w:w="2268"/>
+          </w:tcPr>
+          <w:p>
+            <w:r/>
+            <w:r>
+              <w:rPr>
+                <w:sz w:val="20"/>
+              </w:rPr>
+              <w:t>Email Juice Shop</w:t>
+            </w:r>
+          </w:p>
+        </w:tc>
+        <w:tc>
+          <w:tcPr>
+            <w:tcW w:type="dxa" w:w="3685"/>
+          </w:tcPr>
+          <w:p>
+            <w:r/>
+            <w:r>
+              <w:rPr>
+                <w:sz w:val="20"/>
+              </w:rPr>
+              <w:t>Compte cree sur /#/register</w:t>
+            </w:r>
+          </w:p>
+        </w:tc>
+        <w:tc>
+          <w:tcPr>
+            <w:tcW w:type="dxa" w:w="3685"/>
+          </w:tcPr>
+          <w:p>
+            <w:r/>
+            <w:r>
+              <w:rPr>
+                <w:sz w:val="20"/>
+              </w:rPr>
+              <w:t>Deverrouille le panneau JuiceLab — peut etre n'importe quelle adresse</w:t>
+            </w:r>
+          </w:p>
+        </w:tc>
+      </w:tr>
+    </w:tbl>
+    <w:p>
+      <w:pPr>
+        <w:shd w:val="clear" w:fill="FFF4D6"/>
+      </w:pPr>
+      <w:r>
+        <w:rPr>
+          <w:b w:val="0"/>
+          <w:sz w:val="21"/>
+        </w:rPr>
+        <w:t>Le prof voit la colonne avec ton label (ex. « fabrice ») dans sa matrice. L'email Juice Shop n'est jamais affiche en TD standard. Tu peux mettre eleve@juicelab.local ou n'importe quoi.</w:t>
       </w:r>
     </w:p>
     <w:p>

</xml_diff>

<commit_message>
docs(install): embarque captures dashboard/coach dans les guides Word
generate_install_guides.py :
- ajoute IMG_DIR + constantes des 5 captures docs/img/
- build_prof : matrice cohorte theme clair (sect. ouvrir dashboard),
  note bascule clair/sombre + capture theme sombre, captures admin
  cohortes + eleves (nouvelle sect. gestion), sous-section
  scripts/dashboard.sh (menu + update git pull/rebuild), mention
  dashboard central partage (DASHBOARD-CENTRAL.md)
- build_eleve : capture panneau Coach pedagogique (sect. verifier)
- renumerote les sections prof (1-10) en consequence

Regenere les .docx FR (PROF: 6 images, ELEVE: 2 images) et rafraichit
le guide Docker companion.

Co-Authored-By: Claude Opus 4.8 (1M context) <noreply@anthropic.com>
</commit_message>
<xml_diff>
--- a/docs/GUIDE-INSTALL-ELEVE.docx
+++ b/docs/GUIDE-INSTALL-ELEVE.docx
@@ -43,6 +43,58 @@
     <w:p>
       <w:r>
         <w:t>JuiceLab fait tourner OWASP Juice Shop (la plateforme du TD) sur ton propre poste. Pendant que tu joues, ton poste envoie ta progression au dashboard du professeur, qui suit toute la cohorte en temps reel. Tu n'ouvres jamais le dashboard toi-meme.</w:t>
+      </w:r>
+    </w:p>
+    <w:p>
+      <w:pPr>
+        <w:jc w:val="center"/>
+      </w:pPr>
+      <w:r>
+        <w:drawing>
+          <wp:inline xmlns:a="http://schemas.openxmlformats.org/drawingml/2006/main" xmlns:pic="http://schemas.openxmlformats.org/drawingml/2006/picture">
+            <wp:extent cx="5669280" cy="10011707"/>
+            <wp:docPr id="1" name="Picture 1"/>
+            <wp:cNvGraphicFramePr>
+              <a:graphicFrameLocks noChangeAspect="1"/>
+            </wp:cNvGraphicFramePr>
+            <a:graphic>
+              <a:graphicData uri="http://schemas.openxmlformats.org/drawingml/2006/picture">
+                <pic:pic>
+                  <pic:nvPicPr>
+                    <pic:cNvPr id="0" name="scenario4.png"/>
+                    <pic:cNvPicPr/>
+                  </pic:nvPicPr>
+                  <pic:blipFill>
+                    <a:blip r:embed="rId9"/>
+                    <a:stretch>
+                      <a:fillRect/>
+                    </a:stretch>
+                  </pic:blipFill>
+                  <pic:spPr>
+                    <a:xfrm>
+                      <a:off x="0" y="0"/>
+                      <a:ext cx="5669280" cy="10011707"/>
+                    </a:xfrm>
+                    <a:prstGeom prst="rect"/>
+                  </pic:spPr>
+                </pic:pic>
+              </a:graphicData>
+            </a:graphic>
+          </wp:inline>
+        </w:drawing>
+      </w:r>
+    </w:p>
+    <w:p>
+      <w:pPr>
+        <w:jc w:val="center"/>
+      </w:pPr>
+      <w:r>
+        <w:rPr>
+          <w:i/>
+          <w:color w:val="222222"/>
+          <w:sz w:val="18"/>
+        </w:rPr>
+        <w:t>Ton poste pousse ses events vers le dashboard du prof (scenario 4).</w:t>
       </w:r>
     </w:p>
     <w:p>
@@ -653,6 +705,58 @@
       </w:pPr>
       <w:r>
         <w:t>Tu dois voir le parcours TD JuiceLab. Le score-board OWASP est sur http://127.0.0.1:3000/#/score-board.</w:t>
+      </w:r>
+    </w:p>
+    <w:p>
+      <w:pPr>
+        <w:jc w:val="center"/>
+      </w:pPr>
+      <w:r>
+        <w:drawing>
+          <wp:inline xmlns:a="http://schemas.openxmlformats.org/drawingml/2006/main" xmlns:pic="http://schemas.openxmlformats.org/drawingml/2006/picture">
+            <wp:extent cx="5669280" cy="3830595"/>
+            <wp:docPr id="2" name="Picture 2"/>
+            <wp:cNvGraphicFramePr>
+              <a:graphicFrameLocks noChangeAspect="1"/>
+            </wp:cNvGraphicFramePr>
+            <a:graphic>
+              <a:graphicData uri="http://schemas.openxmlformats.org/drawingml/2006/picture">
+                <pic:pic>
+                  <pic:nvPicPr>
+                    <pic:cNvPr id="0" name="student-overlay.png"/>
+                    <pic:cNvPicPr/>
+                  </pic:nvPicPr>
+                  <pic:blipFill>
+                    <a:blip r:embed="rId10"/>
+                    <a:stretch>
+                      <a:fillRect/>
+                    </a:stretch>
+                  </pic:blipFill>
+                  <pic:spPr>
+                    <a:xfrm>
+                      <a:off x="0" y="0"/>
+                      <a:ext cx="5669280" cy="3830595"/>
+                    </a:xfrm>
+                    <a:prstGeom prst="rect"/>
+                  </pic:spPr>
+                </pic:pic>
+              </a:graphicData>
+            </a:graphic>
+          </wp:inline>
+        </w:drawing>
+      </w:r>
+    </w:p>
+    <w:p>
+      <w:pPr>
+        <w:jc w:val="center"/>
+      </w:pPr>
+      <w:r>
+        <w:rPr>
+          <w:i/>
+          <w:color w:val="222222"/>
+          <w:sz w:val="18"/>
+        </w:rPr>
+        <w:t>Panneau Coach pedagogique cote eleve (briefing, indices gradues, quiz, badges).</w:t>
       </w:r>
     </w:p>
     <w:p>

</xml_diff>

<commit_message>
docs(guides): real cohort/IP + flag verification section in student docx
- generate_install_guides.py: COHORT -> JUICELAB-JUIN-2026, EXAMPLE_IP ->
  187.124.39.123 (this session's real values).
- Student guide: new section 7 'Valider un flag de challenge (bonus +10)'
  (copy flag from Juice Shop, paste in overlay, Verify flag, no student-side
  secret), renumber Depannage/Arreter to 8/9.
- Add a prominent warning after each install command: ALWAYS keep -d /
  -Dashboard <IP>, else the script also installs an isolated local dashboard
  and the teacher sees no progress; -l PRENOM shows the name in the matrix.
- Regenerate both GUIDE-INSTALL-{ELEVE,PROF}.docx (mermaid diagrams rendered,
  refreshed prof screenshots embedded).
</commit_message>
<xml_diff>
--- a/docs/GUIDE-INSTALL-ELEVE.docx
+++ b/docs/GUIDE-INSTALL-ELEVE.docx
@@ -202,7 +202,7 @@
               <w:rPr>
                 <w:sz w:val="20"/>
               </w:rPr>
-              <w:t>192.168.1.10</w:t>
+              <w:t>187.124.39.123</w:t>
             </w:r>
           </w:p>
         </w:tc>
@@ -246,7 +246,7 @@
               <w:rPr>
                 <w:sz w:val="20"/>
               </w:rPr>
-              <w:t>M2-IA-2026</w:t>
+              <w:t>JUICELAB-JUIN-2026</w:t>
             </w:r>
           </w:p>
         </w:tc>
@@ -531,13 +531,25 @@
           <w:rFonts w:ascii="Consolas" w:hAnsi="Consolas"/>
           <w:sz w:val="19"/>
         </w:rPr>
-        <w:t>.\scripts\install-student.ps1 -Dashboard 192.168.1.10 -Label amelie -Cohort M2-IA-2026</w:t>
+        <w:t>.\scripts\install-student.ps1 -Dashboard 187.124.39.123 -Label amelie -Cohort JUICELAB-JUIN-2026</w:t>
       </w:r>
     </w:p>
     <w:p>
       <w:pPr>
         <w:spacing w:after="80"/>
       </w:pPr>
+    </w:p>
+    <w:p>
+      <w:pPr>
+        <w:shd w:val="clear" w:fill="FFF4D6"/>
+      </w:pPr>
+      <w:r>
+        <w:rPr>
+          <w:b w:val="0"/>
+          <w:sz w:val="21"/>
+        </w:rPr>
+        <w:t>IMPORTANT : garde TOUJOURS -Dashboard 187.124.39.123. Sans ce parametre, le script installe en plus un dashboard local isole sur ton poste et le prof ne voit pas ta progression. Le -Label &lt;prenom&gt; affiche ton nom dans la matrice du prof (sinon tu apparais en code technique).</w:t>
+      </w:r>
     </w:p>
     <w:p>
       <w:pPr>
@@ -613,13 +625,25 @@
           <w:rFonts w:ascii="Consolas" w:hAnsi="Consolas"/>
           <w:sz w:val="19"/>
         </w:rPr>
-        <w:t>./scripts/install-student.sh -d 192.168.1.10 -l amelie -c M2-IA-2026</w:t>
+        <w:t>./scripts/install-student.sh -d 187.124.39.123 -l amelie -c JUICELAB-JUIN-2026</w:t>
       </w:r>
     </w:p>
     <w:p>
       <w:pPr>
         <w:spacing w:after="80"/>
       </w:pPr>
+    </w:p>
+    <w:p>
+      <w:pPr>
+        <w:shd w:val="clear" w:fill="FFF4D6"/>
+      </w:pPr>
+      <w:r>
+        <w:rPr>
+          <w:b w:val="0"/>
+          <w:sz w:val="21"/>
+        </w:rPr>
+        <w:t>IMPORTANT : garde TOUJOURS -d 187.124.39.123. Sans ce parametre, le script installe en plus un dashboard local isole sur ton poste et le prof ne voit pas ta progression. Le -l &lt;prenom&gt; affiche ton nom dans la matrice du prof (sinon tu apparais en code technique).</w:t>
+      </w:r>
     </w:p>
     <w:p>
       <w:pPr>
@@ -937,7 +961,64 @@
         <w:pStyle w:val="Heading1"/>
       </w:pPr>
       <w:r>
-        <w:t>7. Depannage</w:t>
+        <w:t>7. Valider un flag de challenge (bonus +10)</w:t>
+      </w:r>
+    </w:p>
+    <w:p>
+      <w:r>
+        <w:t>Certains challenges OWASP affichent un flag (chaine de 40 caracteres hexadecimaux) quand tu les resous en mode CTF. Le valider rapporte 10 points bonus visibles dans la matrice du prof. Tu n'as AUCUN secret a configurer : tout est deja integre cote serveur.</w:t>
+      </w:r>
+    </w:p>
+    <w:p>
+      <w:pPr>
+        <w:pStyle w:val="ListNumber"/>
+      </w:pPr>
+      <w:r>
+        <w:t>Resous un challenge dans Juice Shop : une notification affiche le flag.</w:t>
+      </w:r>
+    </w:p>
+    <w:p>
+      <w:pPr>
+        <w:pStyle w:val="ListNumber"/>
+      </w:pPr>
+      <w:r>
+        <w:t>Copie ce flag (les 40 caracteres hex).</w:t>
+      </w:r>
+    </w:p>
+    <w:p>
+      <w:pPr>
+        <w:pStyle w:val="ListNumber"/>
+      </w:pPr>
+      <w:r>
+        <w:t>Dans le panneau JuiceLab du challenge, colle-le dans le champ flag puis clique « Verifier le flag ».</w:t>
+      </w:r>
+    </w:p>
+    <w:p>
+      <w:pPr>
+        <w:pStyle w:val="ListNumber"/>
+      </w:pPr>
+      <w:r>
+        <w:t>Si le flag est correct : badge « flag +10 » + 10 points bonus chez le prof.</w:t>
+      </w:r>
+    </w:p>
+    <w:p>
+      <w:pPr>
+        <w:shd w:val="clear" w:fill="FFF4D6"/>
+      </w:pPr>
+      <w:r>
+        <w:rPr>
+          <w:b w:val="0"/>
+          <w:sz w:val="21"/>
+        </w:rPr>
+        <w:t>Le flag ne marche pas alors que tu l'as copie exactement ? Previens le prof : la cle de verification (JUICESHOP_CTF_SECRET) est reglee sur SON dashboard, pas sur ton poste. Toi tu n'as rien a faire de ce cote.</w:t>
+      </w:r>
+    </w:p>
+    <w:p>
+      <w:pPr>
+        <w:pStyle w:val="Heading1"/>
+      </w:pPr>
+      <w:r>
+        <w:t>8. Depannage</w:t>
       </w:r>
     </w:p>
     <w:tbl>
@@ -1103,7 +1184,7 @@
               <w:rPr>
                 <w:sz w:val="20"/>
               </w:rPr>
-              <w:t>Verifie que tu as bien passe -d / -Dashboard avec la bonne IP et la meme cohorte (M2-IA-2026) que la classe.</w:t>
+              <w:t>Verifie que tu as bien passe -d / -Dashboard avec la bonne IP et la meme cohorte (JUICELAB-JUIN-2026) que la classe.</w:t>
             </w:r>
           </w:p>
         </w:tc>
@@ -1114,7 +1195,7 @@
         <w:pStyle w:val="Heading1"/>
       </w:pPr>
       <w:r>
-        <w:t>8. Arreter / nettoyer</w:t>
+        <w:t>9. Arreter / nettoyer</w:t>
       </w:r>
     </w:p>
     <w:p>

</xml_diff>